<commit_message>
docs: give the Word manuscript a title page, abstract page, and body start
The journal requires a manuscript containing a title page, an abstract page,
the body, references, and an appendix. The document previously ran the title,
byline, abstract, and body together on one page. It now follows APA 7 front
matter: a title page carrying the title, author, mentor, and project line; the
abstract on its own page with its keywords; and the body beginning on a fresh
page, with references, tables, and figures each starting a new page after it.

26 pages: title 1, abstract 2, body 3-15, references 16-19, table 20,
figures 21-26. Formatting is unchanged: Times New Roman 12 pt, 1.5 line
spacing (double on the title page), 1-inch margins, page numbers, and a
hanging-indent reference list.
</commit_message>
<xml_diff>
--- a/paper_revision_zh_replication/Final_Paper_EN_Chinese_Replication.docx
+++ b/paper_revision_zh_replication/Final_Paper_EN_Chinese_Replication.docx
@@ -50,10 +50,28 @@
         <w:t xml:space="preserve">Mentor: Dr. ZeYu Zhang</w:t>
       </w:r>
     </w:p>
+    <w:p>
+      <w:pPr>
+        <w:pStyle w:val="BodyText"/>
+        <w:widowControl/>
+        <w:spacing w:lineRule="auto" w:line="360" w:before="0" w:after="0"/>
+        <w:ind w:firstLine="720"/>
+      </w:pPr>
+      <w:r>
+        <w:rPr>
+          <w:rFonts w:ascii="Times New Roman" w:hAnsi="Times New Roman"/>
+          <w:i/>
+          <w:iCs/>
+          <w:sz w:val="24"/>
+        </w:rPr>
+        <w:t xml:space="preserve">Project SOCRATES — Self-knowledge Of Confidence: Rating And Testing Epistemic Sensitivity</w:t>
+      </w:r>
+    </w:p>
     <w:bookmarkStart w:id="9" w:name="abstract"/>
     <w:p>
       <w:pPr>
         <w:pStyle w:val="Heading2"/>
+        <w:pageBreakBefore/>
         <w:spacing w:lineRule="auto" w:line="360" w:before="240" w:after="0"/>
         <w:ind w:firstLine="0"/>
         <w:jc w:val="left"/>
@@ -119,6 +137,7 @@
     <w:p>
       <w:pPr>
         <w:pStyle w:val="Heading2"/>
+        <w:pageBreakBefore/>
         <w:spacing w:lineRule="auto" w:line="360" w:before="240" w:after="0"/>
         <w:ind w:firstLine="0"/>
         <w:jc w:val="left"/>

</xml_diff>